<commit_message>
@ feat!: HR enterprise collaboration platform v1.2.0
Phase 1-4 complete with RBAC security hardening, 9+ business subsystems,
chat persistence, admin backend, CSV export, performance indexes,
admin password reset, and UI consistency fixes across all modules.

BREAKING CHANGE: Complete enterprise platform with role-based access
control (5 roles, 53 permissions, 3-dimension data scope), 9 business
subsystems (OA, HR, Finance, Asset, Repair, Website, Estate, Employment,
Data Portal), AI security firewall, and full audit trail.

Co-Authored-By: Claude Opus 4.8 <noreply@anthropic.com>
@
</commit_message>
<xml_diff>
--- a/docs/rbac-phase-prompts.docx
+++ b/docs/rbac-phase-prompts.docx
@@ -679,14 +679,683 @@
       <w:pPr>
         <w:pStyle w:val="167"/>
         <w:shd w:val="clear" w:fill="F2F4F7"/>
+        <w:rPr>
+          <w:rFonts w:ascii="Consolas" w:hAnsi="Consolas" w:eastAsia="微软雅黑"/>
+          <w:color w:val="263238"/>
+          <w:sz w:val="17"/>
+        </w:rPr>
       </w:pPr>
-      <w:r>
-        <w:rPr>
-          <w:rFonts w:ascii="Consolas" w:hAnsi="Consolas" w:eastAsia="微软雅黑"/>
-          <w:color w:val="263238"/>
-          <w:sz w:val="17"/>
-        </w:rPr>
-        <w:t>你是 Replica 项目的资深全栈工程师和安全工程师。</w:t>
+    </w:p>
+    <w:p>
+      <w:pPr>
+        <w:pStyle w:val="167"/>
+        <w:shd w:val="clear" w:fill="F2F4F7"/>
+        <w:rPr>
+          <w:rFonts w:ascii="Consolas" w:hAnsi="Consolas" w:eastAsia="微软雅黑"/>
+          <w:color w:val="263238"/>
+          <w:sz w:val="17"/>
+        </w:rPr>
+      </w:pPr>
+    </w:p>
+    <w:p>
+      <w:pPr>
+        <w:pStyle w:val="167"/>
+        <w:shd w:val="clear" w:fill="F2F4F7"/>
+        <w:rPr>
+          <w:rFonts w:ascii="Consolas" w:hAnsi="Consolas" w:eastAsia="微软雅黑"/>
+          <w:color w:val="263238"/>
+          <w:sz w:val="17"/>
+        </w:rPr>
+      </w:pPr>
+    </w:p>
+    <w:p>
+      <w:pPr>
+        <w:pStyle w:val="167"/>
+        <w:shd w:val="clear" w:fill="F2F4F7"/>
+      </w:pPr>
+      <w:r>
+        <w:rPr>
+          <w:rFonts w:ascii="Consolas" w:hAnsi="Consolas" w:eastAsia="微软雅黑"/>
+          <w:color w:val="263238"/>
+          <w:sz w:val="17"/>
+        </w:rPr>
+        <w:t>你正在 D:\Replica 项目中工作。</w:t>
+      </w:r>
+      <w:r>
+        <w:rPr>
+          <w:rFonts w:ascii="Consolas" w:hAnsi="Consolas" w:eastAsia="微软雅黑"/>
+          <w:color w:val="263238"/>
+          <w:sz w:val="17"/>
+        </w:rPr>
+        <w:br w:type="textWrapping"/>
+      </w:r>
+      <w:r>
+        <w:rPr>
+          <w:rFonts w:ascii="Consolas" w:hAnsi="Consolas" w:eastAsia="微软雅黑"/>
+          <w:color w:val="263238"/>
+          <w:sz w:val="17"/>
+        </w:rPr>
+        <w:br w:type="textWrapping"/>
+      </w:r>
+      <w:r>
+        <w:rPr>
+          <w:rFonts w:ascii="Consolas" w:hAnsi="Consolas" w:eastAsia="微软雅黑"/>
+          <w:color w:val="263238"/>
+          <w:sz w:val="17"/>
+        </w:rPr>
+        <w:t>项目结构：</w:t>
+      </w:r>
+      <w:r>
+        <w:rPr>
+          <w:rFonts w:ascii="Consolas" w:hAnsi="Consolas" w:eastAsia="微软雅黑"/>
+          <w:color w:val="263238"/>
+          <w:sz w:val="17"/>
+        </w:rPr>
+        <w:br w:type="textWrapping"/>
+      </w:r>
+      <w:r>
+        <w:rPr>
+          <w:rFonts w:ascii="Consolas" w:hAnsi="Consolas" w:eastAsia="微软雅黑"/>
+          <w:color w:val="263238"/>
+          <w:sz w:val="17"/>
+        </w:rPr>
+        <w:t>- backend/: FastAPI + SQLAlchemy 后端</w:t>
+      </w:r>
+      <w:r>
+        <w:rPr>
+          <w:rFonts w:ascii="Consolas" w:hAnsi="Consolas" w:eastAsia="微软雅黑"/>
+          <w:color w:val="263238"/>
+          <w:sz w:val="17"/>
+        </w:rPr>
+        <w:br w:type="textWrapping"/>
+      </w:r>
+      <w:r>
+        <w:rPr>
+          <w:rFonts w:ascii="Consolas" w:hAnsi="Consolas" w:eastAsia="微软雅黑"/>
+          <w:color w:val="263238"/>
+          <w:sz w:val="17"/>
+        </w:rPr>
+        <w:t>- frontend/: Vite/TypeScript 前端</w:t>
+      </w:r>
+      <w:r>
+        <w:rPr>
+          <w:rFonts w:ascii="Consolas" w:hAnsi="Consolas" w:eastAsia="微软雅黑"/>
+          <w:color w:val="263238"/>
+          <w:sz w:val="17"/>
+        </w:rPr>
+        <w:br w:type="textWrapping"/>
+      </w:r>
+      <w:r>
+        <w:rPr>
+          <w:rFonts w:ascii="Consolas" w:hAnsi="Consolas" w:eastAsia="微软雅黑"/>
+          <w:color w:val="263238"/>
+          <w:sz w:val="17"/>
+        </w:rPr>
+        <w:t>- docs/rbac-design-v2.md: RBAC v2.0 设计与实施计划</w:t>
+      </w:r>
+      <w:r>
+        <w:rPr>
+          <w:rFonts w:ascii="Consolas" w:hAnsi="Consolas" w:eastAsia="微软雅黑"/>
+          <w:color w:val="263238"/>
+          <w:sz w:val="17"/>
+        </w:rPr>
+        <w:br w:type="textWrapping"/>
+      </w:r>
+      <w:r>
+        <w:rPr>
+          <w:rFonts w:ascii="Consolas" w:hAnsi="Consolas" w:eastAsia="微软雅黑"/>
+          <w:color w:val="263238"/>
+          <w:sz w:val="17"/>
+        </w:rPr>
+        <w:t>- docs/rbac-phase-prompts.md: 当前提示词手册</w:t>
+      </w:r>
+      <w:r>
+        <w:rPr>
+          <w:rFonts w:ascii="Consolas" w:hAnsi="Consolas" w:eastAsia="微软雅黑"/>
+          <w:color w:val="263238"/>
+          <w:sz w:val="17"/>
+        </w:rPr>
+        <w:br w:type="textWrapping"/>
+      </w:r>
+      <w:r>
+        <w:rPr>
+          <w:rFonts w:ascii="Consolas" w:hAnsi="Consolas" w:eastAsia="微软雅黑"/>
+          <w:color w:val="263238"/>
+          <w:sz w:val="17"/>
+        </w:rPr>
+        <w:br w:type="textWrapping"/>
+      </w:r>
+      <w:r>
+        <w:rPr>
+          <w:rFonts w:ascii="Consolas" w:hAnsi="Consolas" w:eastAsia="微软雅黑"/>
+          <w:color w:val="263238"/>
+          <w:sz w:val="17"/>
+        </w:rPr>
+        <w:t>必须遵守：</w:t>
+      </w:r>
+      <w:r>
+        <w:rPr>
+          <w:rFonts w:ascii="Consolas" w:hAnsi="Consolas" w:eastAsia="微软雅黑"/>
+          <w:color w:val="263238"/>
+          <w:sz w:val="17"/>
+        </w:rPr>
+        <w:br w:type="textWrapping"/>
+      </w:r>
+      <w:r>
+        <w:rPr>
+          <w:rFonts w:ascii="Consolas" w:hAnsi="Consolas" w:eastAsia="微软雅黑"/>
+          <w:color w:val="263238"/>
+          <w:sz w:val="17"/>
+        </w:rPr>
+        <w:t>1. 读取文件必须使用 UTF-8 编码。</w:t>
+      </w:r>
+      <w:r>
+        <w:rPr>
+          <w:rFonts w:ascii="Consolas" w:hAnsi="Consolas" w:eastAsia="微软雅黑"/>
+          <w:color w:val="263238"/>
+          <w:sz w:val="17"/>
+        </w:rPr>
+        <w:br w:type="textWrapping"/>
+      </w:r>
+      <w:r>
+        <w:rPr>
+          <w:rFonts w:ascii="Consolas" w:hAnsi="Consolas" w:eastAsia="微软雅黑"/>
+          <w:color w:val="263238"/>
+          <w:sz w:val="17"/>
+        </w:rPr>
+        <w:t>2. 开始修改前，先读取相关现有文件，不能凭空重写。</w:t>
+      </w:r>
+      <w:r>
+        <w:rPr>
+          <w:rFonts w:ascii="Consolas" w:hAnsi="Consolas" w:eastAsia="微软雅黑"/>
+          <w:color w:val="263238"/>
+          <w:sz w:val="17"/>
+        </w:rPr>
+        <w:br w:type="textWrapping"/>
+      </w:r>
+      <w:r>
+        <w:rPr>
+          <w:rFonts w:ascii="Consolas" w:hAnsi="Consolas" w:eastAsia="微软雅黑"/>
+          <w:color w:val="263238"/>
+          <w:sz w:val="17"/>
+        </w:rPr>
+        <w:t>3. 只修改当前 Phase 明确允许的文件。</w:t>
+      </w:r>
+      <w:r>
+        <w:rPr>
+          <w:rFonts w:ascii="Consolas" w:hAnsi="Consolas" w:eastAsia="微软雅黑"/>
+          <w:color w:val="263238"/>
+          <w:sz w:val="17"/>
+        </w:rPr>
+        <w:br w:type="textWrapping"/>
+      </w:r>
+      <w:r>
+        <w:rPr>
+          <w:rFonts w:ascii="Consolas" w:hAnsi="Consolas" w:eastAsia="微软雅黑"/>
+          <w:color w:val="263238"/>
+          <w:sz w:val="17"/>
+        </w:rPr>
+        <w:t>4. 不撤销或覆盖用户已有的无关修改。</w:t>
+      </w:r>
+      <w:r>
+        <w:rPr>
+          <w:rFonts w:ascii="Consolas" w:hAnsi="Consolas" w:eastAsia="微软雅黑"/>
+          <w:color w:val="263238"/>
+          <w:sz w:val="17"/>
+        </w:rPr>
+        <w:br w:type="textWrapping"/>
+      </w:r>
+      <w:r>
+        <w:rPr>
+          <w:rFonts w:ascii="Consolas" w:hAnsi="Consolas" w:eastAsia="微软雅黑"/>
+          <w:color w:val="263238"/>
+          <w:sz w:val="17"/>
+        </w:rPr>
+        <w:t>5. 不使用 git reset --hard、git checkout --、Remove-Item 等破坏性操作。</w:t>
+      </w:r>
+      <w:r>
+        <w:rPr>
+          <w:rFonts w:ascii="Consolas" w:hAnsi="Consolas" w:eastAsia="微软雅黑"/>
+          <w:color w:val="263238"/>
+          <w:sz w:val="17"/>
+        </w:rPr>
+        <w:br w:type="textWrapping"/>
+      </w:r>
+      <w:r>
+        <w:rPr>
+          <w:rFonts w:ascii="Consolas" w:hAnsi="Consolas" w:eastAsia="微软雅黑"/>
+          <w:color w:val="263238"/>
+          <w:sz w:val="17"/>
+        </w:rPr>
+        <w:t>6. 手工编辑文件使用 apply_patch。</w:t>
+      </w:r>
+      <w:r>
+        <w:rPr>
+          <w:rFonts w:ascii="Consolas" w:hAnsi="Consolas" w:eastAsia="微软雅黑"/>
+          <w:color w:val="263238"/>
+          <w:sz w:val="17"/>
+        </w:rPr>
+        <w:br w:type="textWrapping"/>
+      </w:r>
+      <w:r>
+        <w:rPr>
+          <w:rFonts w:ascii="Consolas" w:hAnsi="Consolas" w:eastAsia="微软雅黑"/>
+          <w:color w:val="263238"/>
+          <w:sz w:val="17"/>
+        </w:rPr>
+        <w:t>7. 先写失败测试，再写最小实现，再运行测试。</w:t>
+      </w:r>
+      <w:r>
+        <w:rPr>
+          <w:rFonts w:ascii="Consolas" w:hAnsi="Consolas" w:eastAsia="微软雅黑"/>
+          <w:color w:val="263238"/>
+          <w:sz w:val="17"/>
+        </w:rPr>
+        <w:br w:type="textWrapping"/>
+      </w:r>
+      <w:r>
+        <w:rPr>
+          <w:rFonts w:ascii="Consolas" w:hAnsi="Consolas" w:eastAsia="微软雅黑"/>
+          <w:color w:val="263238"/>
+          <w:sz w:val="17"/>
+        </w:rPr>
+        <w:t>8. 所有权限判断必须在后端执行，不能只依赖前端隐藏按钮。</w:t>
+      </w:r>
+      <w:r>
+        <w:rPr>
+          <w:rFonts w:ascii="Consolas" w:hAnsi="Consolas" w:eastAsia="微软雅黑"/>
+          <w:color w:val="263238"/>
+          <w:sz w:val="17"/>
+        </w:rPr>
+        <w:br w:type="textWrapping"/>
+      </w:r>
+      <w:r>
+        <w:rPr>
+          <w:rFonts w:ascii="Consolas" w:hAnsi="Consolas" w:eastAsia="微软雅黑"/>
+          <w:color w:val="263238"/>
+          <w:sz w:val="17"/>
+        </w:rPr>
+        <w:t>9. 不把 LLM、Prompt、正则表达式作为唯一授权边界。</w:t>
+      </w:r>
+      <w:r>
+        <w:rPr>
+          <w:rFonts w:ascii="Consolas" w:hAnsi="Consolas" w:eastAsia="微软雅黑"/>
+          <w:color w:val="263238"/>
+          <w:sz w:val="17"/>
+        </w:rPr>
+        <w:br w:type="textWrapping"/>
+      </w:r>
+      <w:r>
+        <w:rPr>
+          <w:rFonts w:ascii="Consolas" w:hAnsi="Consolas" w:eastAsia="微软雅黑"/>
+          <w:color w:val="263238"/>
+          <w:sz w:val="17"/>
+        </w:rPr>
+        <w:t>10. 未通过当前 Phase 验收前，不得提前实现下一 Phase。</w:t>
+      </w:r>
+      <w:r>
+        <w:rPr>
+          <w:rFonts w:ascii="Consolas" w:hAnsi="Consolas" w:eastAsia="微软雅黑"/>
+          <w:color w:val="263238"/>
+          <w:sz w:val="17"/>
+        </w:rPr>
+        <w:br w:type="textWrapping"/>
+      </w:r>
+      <w:r>
+        <w:rPr>
+          <w:rFonts w:ascii="Consolas" w:hAnsi="Consolas" w:eastAsia="微软雅黑"/>
+          <w:color w:val="263238"/>
+          <w:sz w:val="17"/>
+        </w:rPr>
+        <w:t>11. 不自动安装网络依赖；若确实需要安装，先报告依赖和原因。</w:t>
+      </w:r>
+      <w:r>
+        <w:rPr>
+          <w:rFonts w:ascii="Consolas" w:hAnsi="Consolas" w:eastAsia="微软雅黑"/>
+          <w:color w:val="263238"/>
+          <w:sz w:val="17"/>
+        </w:rPr>
+        <w:br w:type="textWrapping"/>
+      </w:r>
+      <w:r>
+        <w:rPr>
+          <w:rFonts w:ascii="Consolas" w:hAnsi="Consolas" w:eastAsia="微软雅黑"/>
+          <w:color w:val="263238"/>
+          <w:sz w:val="17"/>
+        </w:rPr>
+        <w:t>12. 完成后必须汇报：修改文件、测试命令、测试结果、未解决问题和下一步建议。</w:t>
+      </w:r>
+    </w:p>
+    <w:p>
+      <w:pPr>
+        <w:pStyle w:val="167"/>
+        <w:shd w:val="clear" w:fill="F2F4F7"/>
+      </w:pPr>
+      <w:r>
+        <w:rPr>
+          <w:rFonts w:ascii="Consolas" w:hAnsi="Consolas" w:eastAsia="微软雅黑"/>
+          <w:color w:val="263238"/>
+          <w:sz w:val="17"/>
+        </w:rPr>
+        <w:t>你正在 D:\Replica 项目中工作。</w:t>
+      </w:r>
+      <w:r>
+        <w:rPr>
+          <w:rFonts w:ascii="Consolas" w:hAnsi="Consolas" w:eastAsia="微软雅黑"/>
+          <w:color w:val="263238"/>
+          <w:sz w:val="17"/>
+        </w:rPr>
+        <w:br w:type="textWrapping"/>
+      </w:r>
+      <w:r>
+        <w:rPr>
+          <w:rFonts w:ascii="Consolas" w:hAnsi="Consolas" w:eastAsia="微软雅黑"/>
+          <w:color w:val="263238"/>
+          <w:sz w:val="17"/>
+        </w:rPr>
+        <w:br w:type="textWrapping"/>
+      </w:r>
+      <w:r>
+        <w:rPr>
+          <w:rFonts w:ascii="Consolas" w:hAnsi="Consolas" w:eastAsia="微软雅黑"/>
+          <w:color w:val="263238"/>
+          <w:sz w:val="17"/>
+        </w:rPr>
+        <w:t>项目结构：</w:t>
+      </w:r>
+      <w:r>
+        <w:rPr>
+          <w:rFonts w:ascii="Consolas" w:hAnsi="Consolas" w:eastAsia="微软雅黑"/>
+          <w:color w:val="263238"/>
+          <w:sz w:val="17"/>
+        </w:rPr>
+        <w:br w:type="textWrapping"/>
+      </w:r>
+      <w:r>
+        <w:rPr>
+          <w:rFonts w:ascii="Consolas" w:hAnsi="Consolas" w:eastAsia="微软雅黑"/>
+          <w:color w:val="263238"/>
+          <w:sz w:val="17"/>
+        </w:rPr>
+        <w:t>- backend/: FastAPI + SQLAlchemy 后端</w:t>
+      </w:r>
+      <w:r>
+        <w:rPr>
+          <w:rFonts w:ascii="Consolas" w:hAnsi="Consolas" w:eastAsia="微软雅黑"/>
+          <w:color w:val="263238"/>
+          <w:sz w:val="17"/>
+        </w:rPr>
+        <w:br w:type="textWrapping"/>
+      </w:r>
+      <w:r>
+        <w:rPr>
+          <w:rFonts w:ascii="Consolas" w:hAnsi="Consolas" w:eastAsia="微软雅黑"/>
+          <w:color w:val="263238"/>
+          <w:sz w:val="17"/>
+        </w:rPr>
+        <w:t>- frontend/: Vite/TypeScript 前端</w:t>
+      </w:r>
+      <w:r>
+        <w:rPr>
+          <w:rFonts w:ascii="Consolas" w:hAnsi="Consolas" w:eastAsia="微软雅黑"/>
+          <w:color w:val="263238"/>
+          <w:sz w:val="17"/>
+        </w:rPr>
+        <w:br w:type="textWrapping"/>
+      </w:r>
+      <w:r>
+        <w:rPr>
+          <w:rFonts w:ascii="Consolas" w:hAnsi="Consolas" w:eastAsia="微软雅黑"/>
+          <w:color w:val="263238"/>
+          <w:sz w:val="17"/>
+        </w:rPr>
+        <w:t>- docs/rbac-design-v2.md: RBAC v2.0 设计与实施计划</w:t>
+      </w:r>
+      <w:r>
+        <w:rPr>
+          <w:rFonts w:ascii="Consolas" w:hAnsi="Consolas" w:eastAsia="微软雅黑"/>
+          <w:color w:val="263238"/>
+          <w:sz w:val="17"/>
+        </w:rPr>
+        <w:br w:type="textWrapping"/>
+      </w:r>
+      <w:r>
+        <w:rPr>
+          <w:rFonts w:ascii="Consolas" w:hAnsi="Consolas" w:eastAsia="微软雅黑"/>
+          <w:color w:val="263238"/>
+          <w:sz w:val="17"/>
+        </w:rPr>
+        <w:t>- docs/rbac-phase-prompts.md: 当前提示词手册</w:t>
+      </w:r>
+      <w:r>
+        <w:rPr>
+          <w:rFonts w:ascii="Consolas" w:hAnsi="Consolas" w:eastAsia="微软雅黑"/>
+          <w:color w:val="263238"/>
+          <w:sz w:val="17"/>
+        </w:rPr>
+        <w:br w:type="textWrapping"/>
+      </w:r>
+      <w:r>
+        <w:rPr>
+          <w:rFonts w:ascii="Consolas" w:hAnsi="Consolas" w:eastAsia="微软雅黑"/>
+          <w:color w:val="263238"/>
+          <w:sz w:val="17"/>
+        </w:rPr>
+        <w:br w:type="textWrapping"/>
+      </w:r>
+      <w:r>
+        <w:rPr>
+          <w:rFonts w:ascii="Consolas" w:hAnsi="Consolas" w:eastAsia="微软雅黑"/>
+          <w:color w:val="263238"/>
+          <w:sz w:val="17"/>
+        </w:rPr>
+        <w:t>必须遵守：</w:t>
+      </w:r>
+      <w:r>
+        <w:rPr>
+          <w:rFonts w:ascii="Consolas" w:hAnsi="Consolas" w:eastAsia="微软雅黑"/>
+          <w:color w:val="263238"/>
+          <w:sz w:val="17"/>
+        </w:rPr>
+        <w:br w:type="textWrapping"/>
+      </w:r>
+      <w:r>
+        <w:rPr>
+          <w:rFonts w:ascii="Consolas" w:hAnsi="Consolas" w:eastAsia="微软雅黑"/>
+          <w:color w:val="263238"/>
+          <w:sz w:val="17"/>
+        </w:rPr>
+        <w:t>1. 读取文件必须使用 UTF-8 编码。</w:t>
+      </w:r>
+      <w:r>
+        <w:rPr>
+          <w:rFonts w:ascii="Consolas" w:hAnsi="Consolas" w:eastAsia="微软雅黑"/>
+          <w:color w:val="263238"/>
+          <w:sz w:val="17"/>
+        </w:rPr>
+        <w:br w:type="textWrapping"/>
+      </w:r>
+      <w:r>
+        <w:rPr>
+          <w:rFonts w:ascii="Consolas" w:hAnsi="Consolas" w:eastAsia="微软雅黑"/>
+          <w:color w:val="263238"/>
+          <w:sz w:val="17"/>
+        </w:rPr>
+        <w:t>2. 开始修改前，先读取相关现有文件，不能凭空重写。</w:t>
+      </w:r>
+      <w:r>
+        <w:rPr>
+          <w:rFonts w:ascii="Consolas" w:hAnsi="Consolas" w:eastAsia="微软雅黑"/>
+          <w:color w:val="263238"/>
+          <w:sz w:val="17"/>
+        </w:rPr>
+        <w:br w:type="textWrapping"/>
+      </w:r>
+      <w:r>
+        <w:rPr>
+          <w:rFonts w:ascii="Consolas" w:hAnsi="Consolas" w:eastAsia="微软雅黑"/>
+          <w:color w:val="263238"/>
+          <w:sz w:val="17"/>
+        </w:rPr>
+        <w:t>3. 只修改当前 Phase 明确允许的文件。</w:t>
+      </w:r>
+      <w:r>
+        <w:rPr>
+          <w:rFonts w:ascii="Consolas" w:hAnsi="Consolas" w:eastAsia="微软雅黑"/>
+          <w:color w:val="263238"/>
+          <w:sz w:val="17"/>
+        </w:rPr>
+        <w:br w:type="textWrapping"/>
+      </w:r>
+      <w:r>
+        <w:rPr>
+          <w:rFonts w:ascii="Consolas" w:hAnsi="Consolas" w:eastAsia="微软雅黑"/>
+          <w:color w:val="263238"/>
+          <w:sz w:val="17"/>
+        </w:rPr>
+        <w:t>4. 不撤销或覆盖用户已有的无关修改。</w:t>
+      </w:r>
+      <w:r>
+        <w:rPr>
+          <w:rFonts w:ascii="Consolas" w:hAnsi="Consolas" w:eastAsia="微软雅黑"/>
+          <w:color w:val="263238"/>
+          <w:sz w:val="17"/>
+        </w:rPr>
+        <w:br w:type="textWrapping"/>
+      </w:r>
+      <w:r>
+        <w:rPr>
+          <w:rFonts w:ascii="Consolas" w:hAnsi="Consolas" w:eastAsia="微软雅黑"/>
+          <w:color w:val="263238"/>
+          <w:sz w:val="17"/>
+        </w:rPr>
+        <w:t>5. 不使用 git reset --hard、git checkout --、Remove-Item 等破坏性操作。</w:t>
+      </w:r>
+      <w:r>
+        <w:rPr>
+          <w:rFonts w:ascii="Consolas" w:hAnsi="Consolas" w:eastAsia="微软雅黑"/>
+          <w:color w:val="263238"/>
+          <w:sz w:val="17"/>
+        </w:rPr>
+        <w:br w:type="textWrapping"/>
+      </w:r>
+      <w:r>
+        <w:rPr>
+          <w:rFonts w:ascii="Consolas" w:hAnsi="Consolas" w:eastAsia="微软雅黑"/>
+          <w:color w:val="263238"/>
+          <w:sz w:val="17"/>
+        </w:rPr>
+        <w:t>6. 手工编辑文件使用 apply_patch。</w:t>
+      </w:r>
+      <w:r>
+        <w:rPr>
+          <w:rFonts w:ascii="Consolas" w:hAnsi="Consolas" w:eastAsia="微软雅黑"/>
+          <w:color w:val="263238"/>
+          <w:sz w:val="17"/>
+        </w:rPr>
+        <w:br w:type="textWrapping"/>
+      </w:r>
+      <w:r>
+        <w:rPr>
+          <w:rFonts w:ascii="Consolas" w:hAnsi="Consolas" w:eastAsia="微软雅黑"/>
+          <w:color w:val="263238"/>
+          <w:sz w:val="17"/>
+        </w:rPr>
+        <w:t>7. 先写失败测试，再写最小实现，再运行测试。</w:t>
+      </w:r>
+      <w:r>
+        <w:rPr>
+          <w:rFonts w:ascii="Consolas" w:hAnsi="Consolas" w:eastAsia="微软雅黑"/>
+          <w:color w:val="263238"/>
+          <w:sz w:val="17"/>
+        </w:rPr>
+        <w:br w:type="textWrapping"/>
+      </w:r>
+      <w:r>
+        <w:rPr>
+          <w:rFonts w:ascii="Consolas" w:hAnsi="Consolas" w:eastAsia="微软雅黑"/>
+          <w:color w:val="263238"/>
+          <w:sz w:val="17"/>
+        </w:rPr>
+        <w:t>8. 所有权限判断必须在后端执行，不能只依赖前端隐藏按钮。</w:t>
+      </w:r>
+      <w:r>
+        <w:rPr>
+          <w:rFonts w:ascii="Consolas" w:hAnsi="Consolas" w:eastAsia="微软雅黑"/>
+          <w:color w:val="263238"/>
+          <w:sz w:val="17"/>
+        </w:rPr>
+        <w:br w:type="textWrapping"/>
+      </w:r>
+      <w:r>
+        <w:rPr>
+          <w:rFonts w:ascii="Consolas" w:hAnsi="Consolas" w:eastAsia="微软雅黑"/>
+          <w:color w:val="263238"/>
+          <w:sz w:val="17"/>
+        </w:rPr>
+        <w:t>9. 不把 LLM、Prompt、正则表达式作为唯一授权边界。</w:t>
+      </w:r>
+      <w:r>
+        <w:rPr>
+          <w:rFonts w:ascii="Consolas" w:hAnsi="Consolas" w:eastAsia="微软雅黑"/>
+          <w:color w:val="263238"/>
+          <w:sz w:val="17"/>
+        </w:rPr>
+        <w:br w:type="textWrapping"/>
+      </w:r>
+      <w:r>
+        <w:rPr>
+          <w:rFonts w:ascii="Consolas" w:hAnsi="Consolas" w:eastAsia="微软雅黑"/>
+          <w:color w:val="263238"/>
+          <w:sz w:val="17"/>
+        </w:rPr>
+        <w:t>10. 未通过当前 Phase 验收前，不得提前实现下一 Phase。</w:t>
+      </w:r>
+      <w:r>
+        <w:rPr>
+          <w:rFonts w:ascii="Consolas" w:hAnsi="Consolas" w:eastAsia="微软雅黑"/>
+          <w:color w:val="263238"/>
+          <w:sz w:val="17"/>
+        </w:rPr>
+        <w:br w:type="textWrapping"/>
+      </w:r>
+      <w:r>
+        <w:rPr>
+          <w:rFonts w:ascii="Consolas" w:hAnsi="Consolas" w:eastAsia="微软雅黑"/>
+          <w:color w:val="263238"/>
+          <w:sz w:val="17"/>
+        </w:rPr>
+        <w:t>11. 不自动安装网络依赖；若确实需要安装，先报告依赖和原因。</w:t>
+      </w:r>
+      <w:r>
+        <w:rPr>
+          <w:rFonts w:ascii="Consolas" w:hAnsi="Consolas" w:eastAsia="微软雅黑"/>
+          <w:color w:val="263238"/>
+          <w:sz w:val="17"/>
+        </w:rPr>
+        <w:br w:type="textWrapping"/>
+      </w:r>
+      <w:r>
+        <w:rPr>
+          <w:rFonts w:ascii="Consolas" w:hAnsi="Consolas" w:eastAsia="微软雅黑"/>
+          <w:color w:val="263238"/>
+          <w:sz w:val="17"/>
+        </w:rPr>
+        <w:t>12. 完成后必须汇报：修改文件、测试命令、测试结果、未解决问题和下一步建议。</w:t>
+      </w:r>
+    </w:p>
+    <w:p>
+      <w:pPr>
+        <w:pStyle w:val="167"/>
+        <w:shd w:val="clear" w:fill="F2F4F7"/>
+      </w:pPr>
+      <w:r>
+        <w:rPr>
+          <w:rFonts w:ascii="Consolas" w:hAnsi="Consolas" w:eastAsia="微软雅黑"/>
+          <w:color w:val="263238"/>
+          <w:sz w:val="17"/>
+        </w:rPr>
+        <w:t>你是 Replica 项目的资深全栈工程师和安全工程师。你正在 D:\Replica 项目中工作。</w:t>
       </w:r>
       <w:r>
         <w:rPr>
@@ -711,6 +1380,94 @@
           <w:sz w:val="17"/>
         </w:rPr>
         <w:t>你的任务是只完成当前指定的一个 Phase，不跨阶段扩展范围。</w:t>
+      </w:r>
+      <w:r>
+        <w:rPr>
+          <w:rFonts w:ascii="Consolas" w:hAnsi="Consolas" w:eastAsia="微软雅黑"/>
+          <w:color w:val="263238"/>
+          <w:sz w:val="17"/>
+        </w:rPr>
+        <w:br w:type="textWrapping"/>
+      </w:r>
+      <w:r>
+        <w:rPr>
+          <w:rFonts w:ascii="Consolas" w:hAnsi="Consolas" w:eastAsia="微软雅黑"/>
+          <w:color w:val="263238"/>
+          <w:sz w:val="17"/>
+        </w:rPr>
+        <w:br w:type="textWrapping"/>
+      </w:r>
+      <w:r>
+        <w:rPr>
+          <w:rFonts w:ascii="Consolas" w:hAnsi="Consolas" w:eastAsia="微软雅黑"/>
+          <w:color w:val="263238"/>
+          <w:sz w:val="17"/>
+        </w:rPr>
+        <w:t>项目结构：</w:t>
+      </w:r>
+      <w:r>
+        <w:rPr>
+          <w:rFonts w:ascii="Consolas" w:hAnsi="Consolas" w:eastAsia="微软雅黑"/>
+          <w:color w:val="263238"/>
+          <w:sz w:val="17"/>
+        </w:rPr>
+        <w:br w:type="textWrapping"/>
+      </w:r>
+      <w:r>
+        <w:rPr>
+          <w:rFonts w:ascii="Consolas" w:hAnsi="Consolas" w:eastAsia="微软雅黑"/>
+          <w:color w:val="263238"/>
+          <w:sz w:val="17"/>
+        </w:rPr>
+        <w:t>- backend/: FastAPI + SQLAlchemy 后端</w:t>
+      </w:r>
+      <w:r>
+        <w:rPr>
+          <w:rFonts w:ascii="Consolas" w:hAnsi="Consolas" w:eastAsia="微软雅黑"/>
+          <w:color w:val="263238"/>
+          <w:sz w:val="17"/>
+        </w:rPr>
+        <w:br w:type="textWrapping"/>
+      </w:r>
+      <w:r>
+        <w:rPr>
+          <w:rFonts w:ascii="Consolas" w:hAnsi="Consolas" w:eastAsia="微软雅黑"/>
+          <w:color w:val="263238"/>
+          <w:sz w:val="17"/>
+        </w:rPr>
+        <w:t>- frontend/: Vite/TypeScript 前端</w:t>
+      </w:r>
+      <w:r>
+        <w:rPr>
+          <w:rFonts w:ascii="Consolas" w:hAnsi="Consolas" w:eastAsia="微软雅黑"/>
+          <w:color w:val="263238"/>
+          <w:sz w:val="17"/>
+        </w:rPr>
+        <w:br w:type="textWrapping"/>
+      </w:r>
+      <w:r>
+        <w:rPr>
+          <w:rFonts w:ascii="Consolas" w:hAnsi="Consolas" w:eastAsia="微软雅黑"/>
+          <w:color w:val="263238"/>
+          <w:sz w:val="17"/>
+        </w:rPr>
+        <w:t>- docs/rbac-design-v2.md: RBAC v2.0 设计与实施计划</w:t>
+      </w:r>
+      <w:r>
+        <w:rPr>
+          <w:rFonts w:ascii="Consolas" w:hAnsi="Consolas" w:eastAsia="微软雅黑"/>
+          <w:color w:val="263238"/>
+          <w:sz w:val="17"/>
+        </w:rPr>
+        <w:br w:type="textWrapping"/>
+      </w:r>
+      <w:r>
+        <w:rPr>
+          <w:rFonts w:ascii="Consolas" w:hAnsi="Consolas" w:eastAsia="微软雅黑"/>
+          <w:color w:val="263238"/>
+          <w:sz w:val="17"/>
+        </w:rPr>
+        <w:t>- docs/rbac-phase-prompts.md: 当前提示词手册</w:t>
       </w:r>
       <w:r>
         <w:rPr>
@@ -9230,17 +9987,7 @@
           <w:color w:val="263238"/>
           <w:sz w:val="17"/>
         </w:rPr>
-        <w:t>- private、dept、org、public 四种数据范围测试通</w:t>
-      </w:r>
-      <w:bookmarkStart w:id="0" w:name="_GoBack"/>
-      <w:bookmarkEnd w:id="0"/>
-      <w:r>
-        <w:rPr>
-          <w:rFonts w:ascii="Consolas" w:hAnsi="Consolas" w:eastAsia="微软雅黑"/>
-          <w:color w:val="263238"/>
-          <w:sz w:val="17"/>
-        </w:rPr>
-        <w:t>过。</w:t>
+        <w:t>- private、dept、org、public 四种数据范围测试通过。</w:t>
       </w:r>
       <w:r>
         <w:rPr>
@@ -14088,6 +14835,7 @@
         <w:pStyle w:val="167"/>
         <w:shd w:val="clear" w:fill="F2F4F7"/>
       </w:pPr>
+      <w:bookmarkStart w:id="0" w:name="_GoBack"/>
       <w:r>
         <w:rPr>
           <w:rFonts w:ascii="Consolas" w:hAnsi="Consolas" w:eastAsia="微软雅黑"/>
@@ -14769,6 +15517,7 @@
         <w:t>APPROVE / APPROVE_WITH_RISKS / BLOCK</w:t>
       </w:r>
     </w:p>
+    <w:bookmarkEnd w:id="0"/>
     <w:p>
       <w:pPr>
         <w:spacing w:before="40" w:after="80"/>
@@ -16514,7 +17263,7 @@
     <w:lsdException w:qFormat="1" w:uiPriority="99" w:semiHidden="0" w:name="List"/>
     <w:lsdException w:qFormat="1" w:uiPriority="99" w:semiHidden="0" w:name="List Bullet"/>
     <w:lsdException w:qFormat="1" w:uiPriority="99" w:semiHidden="0" w:name="List Number"/>
-    <w:lsdException w:uiPriority="99" w:semiHidden="0" w:name="List 2"/>
+    <w:lsdException w:qFormat="1" w:uiPriority="99" w:semiHidden="0" w:name="List 2"/>
     <w:lsdException w:qFormat="1" w:uiPriority="99" w:semiHidden="0" w:name="List 3"/>
     <w:lsdException w:uiPriority="99" w:name="List 4"/>
     <w:lsdException w:uiPriority="99" w:name="List 5"/>
@@ -17152,6 +17901,7 @@
     <w:name w:val="List 2"/>
     <w:basedOn w:val="1"/>
     <w:unhideWhenUsed/>
+    <w:qFormat/>
     <w:uiPriority w:val="99"/>
     <w:pPr>
       <w:ind w:left="720" w:hanging="360"/>

</xml_diff>